<commit_message>
Adopt Ashman's revised preprint; back-propagate to thesis v1.5
Replace preprint docx with Ashman's revised upload and sync the
markdown source (v1.1): author note with AI-tool disclosure, softened
Anomaly 2 inference, new narcissistic-configuration paragraph
(transdiagnostic PIP mechanism, narcissism as its configuration),
Prediction 3 broadened to credibility/consequence/attackability,
clinical section hedged. Thesis v1.5 carries the two conceptual
upgrades: configuration remark in 3.1 and refined Proposition 3.4
with operation-selection coding implications for Studies 2 and 3.

Co-Authored-By: Claude Fable 5 <noreply@anthropic.com>
Claude-Session: https://claude.ai/code/session_01QL3EJ3K6pMmxe9RMngZErs
</commit_message>
<xml_diff>
--- a/protecting_the_lie_preprint.docx
+++ b/protecting_the_lie_preprint.docx
@@ -119,6 +119,27 @@
     </w:p>
     <w:p>
       <w:pPr>
+        <w:spacing w:after="160" w:line="300"/>
+        <w:jc w:val="both"/>
+      </w:pPr>
+      <w:r>
+        <w:rPr>
+          <w:rFonts w:ascii="Times New Roman" w:hAnsi="Times New Roman" w:eastAsia="Times New Roman"/>
+          <w:b/>
+          <w:sz w:val="20"/>
+        </w:rPr>
+        <w:t xml:space="preserve">Author note. </w:t>
+      </w:r>
+      <w:r>
+        <w:rPr>
+          <w:rFonts w:ascii="Times New Roman" w:hAnsi="Times New Roman" w:eastAsia="Times New Roman"/>
+          <w:sz w:val="20"/>
+        </w:rPr>
+        <w:t>No external funding supported this work, and the author declares no conflicts of interest. Claude and ChatGPT were used as drafting, critique, and organizational tools. The author directed the argument and revisions, selected the final wording, and accepts responsibility for the manuscript.</w:t>
+      </w:r>
+    </w:p>
+    <w:p>
+      <w:pPr>
         <w:pStyle w:val="Heading1"/>
         <w:spacing w:after="160" w:before="280"/>
       </w:pPr>
@@ -218,21 +239,18 @@
       </w:pPr>
       <w:r>
         <w:rPr>
-          <w:rFonts w:ascii="Times New Roman" w:cs="Times New Roman" w:eastAsia="Times New Roman" w:hAnsi="Times New Roman"/>
-          <w:b/>
-          <w:bCs/>
-          <w:sz w:val="22"/>
-          <w:szCs w:val="22"/>
+          <w:rFonts w:ascii="Times New Roman" w:hAnsi="Times New Roman" w:eastAsia="Times New Roman"/>
+          <w:b/>
+          <w:sz w:val="22"/>
         </w:rPr>
         <w:t xml:space="preserve">The response to contradiction. </w:t>
       </w:r>
       <w:r>
         <w:rPr>
-          <w:rFonts w:ascii="Times New Roman" w:cs="Times New Roman" w:eastAsia="Times New Roman" w:hAnsi="Times New Roman"/>
-          <w:sz w:val="22"/>
-          <w:szCs w:val="22"/>
-        </w:rPr>
-        <w:t xml:space="preserve">On the fuel picture, criticism is a supply interruption, and the predicted response is renewed extraction elsewhere. What is actually observed is a stereotyped emergency repertoire: deny the evidence, discredit the witness, rewrite the history, attack the critic, reverse victim and offender. Freyd (1997) named the core of this pattern DARVO, and experimental work shows it is effective: exposure to DARVO responses reduces perceived perpetrator responsibility and victim credibility (Harsey &amp; Freyd, 2020). A fuel interruption does not explain why the witness must be discredited rather than merely replaced. Witnesses are only worth destroying if they threaten something structural.</w:t>
+          <w:rFonts w:ascii="Times New Roman" w:hAnsi="Times New Roman" w:eastAsia="Times New Roman"/>
+          <w:sz w:val="22"/>
+        </w:rPr>
+        <w:t>On the fuel picture, criticism is a supply interruption, and the predicted response is renewed extraction elsewhere. What is actually observed is a stereotyped emergency repertoire: deny the evidence, discredit the witness, rewrite the history, attack the critic, reverse victim and offender. Freyd (1997) named the core of this pattern DARVO, and experimental work shows it is effective: exposure to DARVO responses reduces perceived perpetrator responsibility and victim credibility (Harsey &amp; Freyd, 2020). A fuel interruption does not by itself explain why the witness is discredited rather than merely replaced. The effort devoted to discrediting the witness suggests that contradiction may threaten something more structural than the interruption of a rewarding social signal.</w:t>
       </w:r>
     </w:p>
     <w:p>
@@ -381,6 +399,27 @@
       </w:pPr>
       <w:r>
         <w:rPr>
+          <w:rFonts w:ascii="Times New Roman" w:hAnsi="Times New Roman" w:eastAsia="Times New Roman"/>
+          <w:b/>
+          <w:sz w:val="22"/>
+        </w:rPr>
+        <w:t xml:space="preserve">The narcissistic configuration. </w:t>
+      </w:r>
+      <w:r>
+        <w:rPr>
+          <w:rFonts w:ascii="Times New Roman" w:hAnsi="Times New Roman" w:eastAsia="Times New Roman"/>
+          <w:sz w:val="22"/>
+        </w:rPr>
+        <w:t>Protected Identity Propositions are not proposed as unique to narcissism and may represent a transdiagnostic mechanism of identity-protective cognition. Their narcissistic configuration is marked by the content and interpersonal organization of the protected claim: exceptional status, entitlement, innocence, blamelessness, or exemption from reciprocal accountability; dependence on other people as confirmation instruments; and recurrent efforts to control witnesses, records, and moral roles when the claim is challenged. The model therefore does not define narcissism by revision resistance alone, but by the organization of revision resistance around privileged self-status and interpersonal asymmetry.</w:t>
+      </w:r>
+    </w:p>
+    <w:p>
+      <w:pPr>
+        <w:spacing w:after="160" w:line="300"/>
+        <w:jc w:val="both"/>
+      </w:pPr>
+      <w:r>
+        <w:rPr>
           <w:rFonts w:ascii="Times New Roman" w:cs="Times New Roman" w:eastAsia="Times New Roman" w:hAnsi="Times New Roman"/>
           <w:b/>
           <w:bCs/>
@@ -609,21 +648,18 @@
       </w:pPr>
       <w:r>
         <w:rPr>
-          <w:rFonts w:ascii="Times New Roman" w:cs="Times New Roman" w:eastAsia="Times New Roman" w:hAnsi="Times New Roman"/>
-          <w:b/>
-          <w:bCs/>
-          <w:sz w:val="22"/>
-          <w:szCs w:val="22"/>
-        </w:rPr>
-        <w:t xml:space="preserve">Credibility-scaled discrediting. </w:t>
-      </w:r>
-      <w:r>
-        <w:rPr>
-          <w:rFonts w:ascii="Times New Roman" w:cs="Times New Roman" w:eastAsia="Times New Roman" w:hAnsi="Times New Roman"/>
-          <w:sz w:val="22"/>
-          <w:szCs w:val="22"/>
-        </w:rPr>
-        <w:t xml:space="preserve">The effort spent discrediting a disconfirming witness should increase with the witness's credibility, inverting ordinary epistemics, in which credible disagreement produces the most belief revision.</w:t>
+          <w:rFonts w:ascii="Times New Roman" w:hAnsi="Times New Roman" w:eastAsia="Times New Roman"/>
+          <w:b/>
+          <w:sz w:val="22"/>
+        </w:rPr>
+        <w:t xml:space="preserve">Credibility, consequence, and attackability. </w:t>
+      </w:r>
+      <w:r>
+        <w:rPr>
+          <w:rFonts w:ascii="Times New Roman" w:hAnsi="Times New Roman" w:eastAsia="Times New Roman"/>
+          <w:sz w:val="22"/>
+        </w:rPr>
+        <w:t>Defensive urgency should increase with a witness's credibility and ability to make the contradiction socially consequential. The selected protection operation should depend on perceived attackability: an attackable witness may be discredited directly, whereas a powerful witness may prompt strategic compliance, withdrawal, audience-switching, delayed retaliation, or private devaluation.</w:t>
       </w:r>
     </w:p>
     <w:p>
@@ -772,6 +808,36 @@
       </w:pPr>
       <w:r>
         <w:rPr>
+          <w:rFonts w:ascii="Times New Roman" w:hAnsi="Times New Roman" w:eastAsia="Times New Roman"/>
+          <w:sz w:val="22"/>
+        </w:rPr>
+        <w:t>If the model is correct, esteem support and supply management may be insufficient unless they ultimately increase corrigibility, the capacity to let evidence revise a self-defining account. Therapeutic improvement should track the degree to which self-relevant correction becomes tolerable and usable. Shame tolerance may be a prerequisite, because the barrier to revision is the forecast of annihilation. This also yields a prognostic reading of the alliance: the therapist is a high-credibility witness, so idealization while confirming and devaluation precisely when most accurate are what the model expects, and rupture timing becomes data. These are hypotheses for treatment research, not established findings. The outcome measure they imply is concrete: not how the person shines, but what they do when accurately, credibly, and kindly contradicted.</w:t>
+      </w:r>
+    </w:p>
+    <w:p>
+      <w:pPr>
+        <w:pStyle w:val="Heading1"/>
+        <w:spacing w:after="160" w:before="280"/>
+      </w:pPr>
+      <w:r>
+        <w:rPr>
+          <w:rFonts w:ascii="Times New Roman" w:cs="Times New Roman" w:eastAsia="Times New Roman" w:hAnsi="Times New Roman"/>
+          <w:b/>
+          <w:bCs/>
+          <w:color w:val="000000"/>
+          <w:sz w:val="24"/>
+          <w:szCs w:val="24"/>
+        </w:rPr>
+        <w:t xml:space="preserve">9. Limitations</w:t>
+      </w:r>
+    </w:p>
+    <w:p>
+      <w:pPr>
+        <w:spacing w:after="160" w:line="300"/>
+        <w:jc w:val="both"/>
+      </w:pPr>
+      <w:r>
+        <w:rPr>
           <w:rFonts w:ascii="Times New Roman" w:cs="Times New Roman" w:eastAsia="Times New Roman" w:hAnsi="Times New Roman"/>
           <w:b w:val="false"/>
           <w:bCs w:val="false"/>
@@ -780,7 +846,7 @@
           <w:sz w:val="22"/>
           <w:szCs w:val="22"/>
         </w:rPr>
-        <w:t xml:space="preserve">If the model is correct, esteem support and supply management are palliative: the deficit is not esteem level but corrigibility, the capacity to let evidence revise a self-defining account. Therapy succeeds when correction becomes survivable, which requires shame tolerance first, because the barrier to revision is the forecast of annihilation. This also yields a prognostic reading of the alliance: the therapist is a high-credibility witness, so idealization while confirming and devaluation precisely when most accurate are what the model expects, and rupture timing becomes data. These are hypotheses for treatment research, not established findings. The outcome measure they imply is concrete: not how the person shines, but what they do when accurately, credibly, and kindly contradicted.</w:t>
+        <w:t xml:space="preserve">This is a theoretical proposal. Its constructs require validation: the protected proposition must be identified per person (a structured elicitation interview is proposed in the companion research program), and self-report will be least reliable at exactly the point being measured, so behavioral, informant, and longitudinal validation are required. The hardest methodological problem is separating identity-diagnosticity from ordinary aversiveness in contradiction paradigms; if the two cannot be unconfounded, the model's central predictions cannot be tested cleanly. One prediction is already challenged by existing evidence and has been narrowed accordingly. Finally, the reconceptualization applies to narcissistic personality organization across the spectrum, with strong claims reserved for the pathological range; it does not claim that every self-serving bias is narcissism, and it does not authorize diagnosing individuals at a distance.</w:t>
       </w:r>
     </w:p>
     <w:p>
@@ -797,7 +863,7 @@
           <w:sz w:val="24"/>
           <w:szCs w:val="24"/>
         </w:rPr>
-        <w:t xml:space="preserve">9. Limitations</w:t>
+        <w:t xml:space="preserve">10. Conclusion</w:t>
       </w:r>
     </w:p>
     <w:p>
@@ -815,12 +881,13 @@
           <w:sz w:val="22"/>
           <w:szCs w:val="22"/>
         </w:rPr>
-        <w:t xml:space="preserve">This is a theoretical proposal. Its constructs require validation: the protected proposition must be identified per person (a structured elicitation interview is proposed in the companion research program), and self-report will be least reliable at exactly the point being measured, so behavioral, informant, and longitudinal validation are required. The hardest methodological problem is separating identity-diagnosticity from ordinary aversiveness in contradiction paradigms; if the two cannot be unconfounded, the model's central predictions cannot be tested cleanly. One prediction is already challenged by existing evidence and has been narrowed accordingly. Finally, the reconceptualization applies to narcissistic personality organization across the spectrum, with strong claims reserved for the pathological range; it does not claim that every self-serving bias is narcissism, and it does not authorize diagnosing individuals at a distance.</w:t>
+        <w:t xml:space="preserve">The supply construct survives, demoted and clarified: supply is real, sought, and harvested, but it is the perimeter report of a defended proposition, not the commodity of an appetite. Narcissism, on this account, is not an addiction to attention. It is an organized refusal of reality, and supply is whatever helps keep the refusal intact. The engine is a self-defining proposition that has been removed from reality's correction process. The belief is not allowed to lose; everything else follows from that.</w:t>
       </w:r>
     </w:p>
     <w:p>
       <w:pPr>
         <w:pStyle w:val="Heading1"/>
+        <w:pageBreakBefore/>
         <w:spacing w:after="160" w:before="280"/>
       </w:pPr>
       <w:r>
@@ -832,41 +899,6 @@
           <w:sz w:val="24"/>
           <w:szCs w:val="24"/>
         </w:rPr>
-        <w:t xml:space="preserve">10. Conclusion</w:t>
-      </w:r>
-    </w:p>
-    <w:p>
-      <w:pPr>
-        <w:spacing w:after="160" w:line="300"/>
-        <w:jc w:val="both"/>
-      </w:pPr>
-      <w:r>
-        <w:rPr>
-          <w:rFonts w:ascii="Times New Roman" w:cs="Times New Roman" w:eastAsia="Times New Roman" w:hAnsi="Times New Roman"/>
-          <w:b w:val="false"/>
-          <w:bCs w:val="false"/>
-          <w:i w:val="false"/>
-          <w:iCs w:val="false"/>
-          <w:sz w:val="22"/>
-          <w:szCs w:val="22"/>
-        </w:rPr>
-        <w:t xml:space="preserve">The supply construct survives, demoted and clarified: supply is real, sought, and harvested, but it is the perimeter report of a defended proposition, not the commodity of an appetite. Narcissism, on this account, is not an addiction to attention. It is an organized refusal of reality, and supply is whatever helps keep the refusal intact. The engine is a self-defining proposition that has been removed from reality's correction process. The belief is not allowed to lose; everything else follows from that.</w:t>
-      </w:r>
-    </w:p>
-    <w:p>
-      <w:pPr>
-        <w:pStyle w:val="Heading1"/>
-        <w:spacing w:after="160" w:before="280"/>
-      </w:pPr>
-      <w:r>
-        <w:rPr>
-          <w:rFonts w:ascii="Times New Roman" w:cs="Times New Roman" w:eastAsia="Times New Roman" w:hAnsi="Times New Roman"/>
-          <w:b/>
-          <w:bCs/>
-          <w:color w:val="000000"/>
-          <w:sz w:val="24"/>
-          <w:szCs w:val="24"/>
-        </w:rPr>
         <w:t xml:space="preserve">References</w:t>
       </w:r>
     </w:p>
@@ -1123,6 +1155,7 @@
       </w:r>
     </w:p>
     <w:sectPr>
+      <w:footerReference w:type="default" r:id="rId8"/>
       <w:pgSz w:w="12240" w:h="15840" w:orient="portrait"/>
       <w:pgMar w:top="1440" w:right="1440" w:bottom="1440" w:left="1440" w:header="708" w:footer="708" w:gutter="0"/>
       <w:pgNumType/>
@@ -1171,6 +1204,26 @@
     </w:p>
   </w:endnote>
 </w:endnotes>
+</file>
+
+<file path=word/footer1.xml><?xml version="1.0" encoding="utf-8"?>
+<w:ftr xmlns:m="http://schemas.openxmlformats.org/officeDocument/2006/math" xmlns:mc="http://schemas.openxmlformats.org/markup-compatibility/2006" xmlns:mo="http://schemas.microsoft.com/office/mac/office/2008/main" xmlns:mv="urn:schemas-microsoft-com:mac:vml" xmlns:o="urn:schemas-microsoft-com:office:office" xmlns:r="http://schemas.openxmlformats.org/officeDocument/2006/relationships" xmlns:v="urn:schemas-microsoft-com:vml" xmlns:w10="urn:schemas-microsoft-com:office:word" xmlns:w14="http://schemas.microsoft.com/office/word/2010/wordml" xmlns:w="http://schemas.openxmlformats.org/wordprocessingml/2006/main" xmlns:wne="http://schemas.microsoft.com/office/word/2006/wordml" xmlns:wp14="http://schemas.microsoft.com/office/word/2010/wordprocessingDrawing" xmlns:wp="http://schemas.openxmlformats.org/drawingml/2006/wordprocessingDrawing" xmlns:wpc="http://schemas.microsoft.com/office/word/2010/wordprocessingCanvas" xmlns:wpg="http://schemas.microsoft.com/office/word/2010/wordprocessingGroup" xmlns:wpi="http://schemas.microsoft.com/office/word/2010/wordprocessingInk" xmlns:wps="http://schemas.microsoft.com/office/word/2010/wordprocessingShape" mc:Ignorable="w14 wp14">
+  <w:p>
+    <w:pPr>
+      <w:pStyle w:val="Footer"/>
+      <w:jc w:val="center"/>
+    </w:pPr>
+    <w:r>
+      <w:rPr>
+        <w:rFonts w:ascii="Times New Roman" w:hAnsi="Times New Roman"/>
+        <w:sz w:val="20"/>
+      </w:rPr>
+      <w:fldChar w:fldCharType="begin"/>
+      <w:instrText xml:space="preserve"> PAGE </w:instrText>
+      <w:fldChar w:fldCharType="end"/>
+    </w:r>
+  </w:p>
+</w:ftr>
 </file>
 
 <file path=word/footnotes.xml><?xml version="1.0" encoding="utf-8"?>

</xml_diff>